<commit_message>
Show editor HTML in a browser next to the DOCX made from it
Co-Authored-By: Claude Opus 5 <noreply@anthropic.com>
</commit_message>
<xml_diff>
--- a/examples/editor.docx
+++ b/examples/editor.docx
@@ -132,8 +132,8 @@
         <w:tblLook w:val="04A0" w:firstRow="1" w:lastRow="0" w:firstColumn="1" w:lastColumn="0" w:noHBand="0" w:noVBand="1"/>
       </w:tblPr>
       <w:tblGrid>
-        <w:gridCol w:w="4819"/>
-        <w:gridCol w:w="4819"/>
+        <w:gridCol w:w="5315"/>
+        <w:gridCol w:w="4323"/>
       </w:tblGrid>
       <w:tr>
         <w:trPr>
@@ -141,7 +141,7 @@
         </w:trPr>
         <w:tc>
           <w:tcPr>
-            <w:tcW w:w="4819" w:type="dxa"/>
+            <w:tcW w:w="5315" w:type="dxa"/>
             <w:tcBorders>
               <w:top w:val="single" w:sz="6" w:space="0" w:color="8EAADB"/>
               <w:left w:val="single" w:sz="6" w:space="0" w:color="8EAADB"/>
@@ -177,7 +177,7 @@
         </w:tc>
         <w:tc>
           <w:tcPr>
-            <w:tcW w:w="4819" w:type="dxa"/>
+            <w:tcW w:w="4323" w:type="dxa"/>
             <w:tcBorders>
               <w:top w:val="single" w:sz="6" w:space="0" w:color="8EAADB"/>
               <w:left w:val="single" w:sz="6" w:space="0" w:color="8EAADB"/>
@@ -215,7 +215,7 @@
       <w:tr>
         <w:tc>
           <w:tcPr>
-            <w:tcW w:w="4819" w:type="dxa"/>
+            <w:tcW w:w="5315" w:type="dxa"/>
             <w:tcBorders>
               <w:top w:val="single" w:sz="6" w:space="0" w:color="8EAADB"/>
               <w:left w:val="single" w:sz="6" w:space="0" w:color="8EAADB"/>
@@ -238,7 +238,7 @@
         </w:tc>
         <w:tc>
           <w:tcPr>
-            <w:tcW w:w="4819" w:type="dxa"/>
+            <w:tcW w:w="4323" w:type="dxa"/>
             <w:tcBorders>
               <w:top w:val="single" w:sz="6" w:space="0" w:color="8EAADB"/>
               <w:left w:val="single" w:sz="6" w:space="0" w:color="8EAADB"/>
@@ -265,7 +265,7 @@
       <w:tr>
         <w:tc>
           <w:tcPr>
-            <w:tcW w:w="4819" w:type="dxa"/>
+            <w:tcW w:w="5315" w:type="dxa"/>
             <w:tcBorders>
               <w:top w:val="single" w:sz="6" w:space="0" w:color="8EAADB"/>
               <w:left w:val="single" w:sz="6" w:space="0" w:color="8EAADB"/>
@@ -289,7 +289,7 @@
         </w:tc>
         <w:tc>
           <w:tcPr>
-            <w:tcW w:w="4819" w:type="dxa"/>
+            <w:tcW w:w="4323" w:type="dxa"/>
             <w:tcBorders>
               <w:top w:val="single" w:sz="6" w:space="0" w:color="8EAADB"/>
               <w:left w:val="single" w:sz="6" w:space="0" w:color="8EAADB"/>
@@ -372,7 +372,10 @@
       </w:r>
     </w:p>
     <w:p>
-      <w:pPr/>
+      <w:pPr>
+        <w:spacing w:before="220" w:after="220"/>
+        <w:ind w:left="600" w:right="600"/>
+      </w:pPr>
       <w:r>
         <w:t xml:space="preserve">Every month of the quarter beat the same month of last year.</w:t>
       </w:r>

</xml_diff>

<commit_message>
Show a floated picture in the editor HTML example
Co-Authored-By: Claude Opus 5 <noreply@anthropic.com>
</commit_message>
<xml_diff>
--- a/examples/editor.docx
+++ b/examples/editor.docx
@@ -374,6 +374,59 @@
     <w:p>
       <w:pPr>
         <w:spacing w:before="220" w:after="220"/>
+      </w:pPr>
+      <w:r>
+        <w:drawing>
+          <wp:anchor distT="0" distB="0" distL="114300" distR="114300" simplePos="0" relativeHeight="2" behindDoc="0" locked="0" layoutInCell="1" allowOverlap="1">
+            <wp:simplePos x="0" y="0"/>
+            <wp:positionH relativeFrom="column">
+              <wp:align>right</wp:align>
+            </wp:positionH>
+            <wp:positionV relativeFrom="paragraph">
+              <wp:posOffset>0</wp:posOffset>
+            </wp:positionV>
+            <wp:extent cx="1905000" cy="873125"/>
+            <wp:effectExtent l="0" t="0" r="0" b="0"/>
+            <wp:wrapSquare wrapText="bothSides"/>
+            <wp:docPr id="2" name="Picture 2" descr="Revenue by month"/>
+            <wp:cNvGraphicFramePr>
+              <a:graphicFrameLocks noChangeAspect="1"/>
+            </wp:cNvGraphicFramePr>
+            <a:graphic>
+              <a:graphicData uri="http://schemas.openxmlformats.org/drawingml/2006/picture">
+                <pic:pic>
+                  <pic:nvPicPr>
+                    <pic:cNvPr id="2" name="Picture 2"/>
+                    <pic:cNvPicPr/>
+                  </pic:nvPicPr>
+                  <pic:blipFill>
+                    <a:blip r:embed="rId5"/>
+                    <a:stretch>
+                      <a:fillRect/>
+                    </a:stretch>
+                  </pic:blipFill>
+                  <pic:spPr>
+                    <a:xfrm>
+                      <a:off x="0" y="0"/>
+                      <a:ext cx="1905000" cy="873125"/>
+                    </a:xfrm>
+                    <a:prstGeom prst="rect">
+                      <a:avLst/>
+                    </a:prstGeom>
+                  </pic:spPr>
+                </pic:pic>
+              </a:graphicData>
+            </a:graphic>
+          </wp:anchor>
+        </w:drawing>
+      </w:r>
+      <w:r>
+        <w:t xml:space="preserve">Every region reported on time. The north opened its new store in May and the west moved half of its sales online; the south stayed flat, as planned. The chart on the right repeats the monthly revenue at a smaller size, so the text flows around it the way it does in the editor.</w:t>
+      </w:r>
+    </w:p>
+    <w:p>
+      <w:pPr>
+        <w:spacing w:before="220" w:after="220"/>
         <w:ind w:left="600" w:right="600"/>
       </w:pPr>
       <w:r>

</xml_diff>

<commit_message>
Publish the examples, and let CI keep them current
examples/build.php also writes the index page the examples are
published with, a workflow deploys examples/ to GitHub Pages, and CI
runs the build and fails when what is committed is not what the library
writes (the build is reproducible; only the Word steps are not).

Co-Authored-By: Claude Opus 5 <noreply@anthropic.com>
</commit_message>
<xml_diff>
--- a/examples/editor.docx
+++ b/examples/editor.docx
@@ -155,6 +155,7 @@
               <w:bottom w:w="60" w:type="dxa"/>
               <w:right w:w="120" w:type="dxa"/>
             </w:tcMar>
+            <w:vAlign w:val="center"/>
           </w:tcPr>
           <w:p>
             <w:pPr>
@@ -191,6 +192,7 @@
               <w:bottom w:w="60" w:type="dxa"/>
               <w:right w:w="120" w:type="dxa"/>
             </w:tcMar>
+            <w:vAlign w:val="center"/>
           </w:tcPr>
           <w:p>
             <w:pPr>
@@ -228,6 +230,7 @@
               <w:bottom w:w="60" w:type="dxa"/>
               <w:right w:w="120" w:type="dxa"/>
             </w:tcMar>
+            <w:vAlign w:val="center"/>
           </w:tcPr>
           <w:p>
             <w:pPr/>
@@ -251,6 +254,7 @@
               <w:bottom w:w="60" w:type="dxa"/>
               <w:right w:w="120" w:type="dxa"/>
             </w:tcMar>
+            <w:vAlign w:val="center"/>
           </w:tcPr>
           <w:p>
             <w:pPr>
@@ -279,6 +283,7 @@
               <w:bottom w:w="60" w:type="dxa"/>
               <w:right w:w="120" w:type="dxa"/>
             </w:tcMar>
+            <w:vAlign w:val="center"/>
           </w:tcPr>
           <w:p>
             <w:pPr/>
@@ -303,6 +308,7 @@
               <w:bottom w:w="60" w:type="dxa"/>
               <w:right w:w="120" w:type="dxa"/>
             </w:tcMar>
+            <w:vAlign w:val="center"/>
           </w:tcPr>
           <w:p>
             <w:pPr>

</xml_diff>

<commit_message>
Space line-height: normal as the browser rounds it
Chromium rounds a font's ascent, descent and line gap to whole pixels
each, so its normal line of Calibri at 11pt is 14 + 4 = 18px, 13.5pt,
where Word's single line is 13.43pt; plain HTML and TipTap text drifted
up 0.07pt a line. `line-height: normal` now reaches Word as the multiple
of that rounded line, and the lowering of the text is worked out on it.
A line holding only a picture keeps the picture's height.

Bench, HTML to DOCX: plain lists 93.5 to 95.2, text 96.8 to 97.3,
tables 99.4 to 99.6; TipTap lists 94.9 to 95.2, text 96.8 to 97.3.
Pictures, plain and TipTap, 99.6/99.5 to 99.4: a 1-twip change of spacing
moves a picture one pixel row in Word's print.

Co-Authored-By: Claude Opus 5.5 <noreply@anthropic.com>
</commit_message>
<xml_diff>
--- a/examples/editor.docx
+++ b/examples/editor.docx
@@ -5,7 +5,7 @@
     <w:p>
       <w:pPr>
         <w:pStyle w:val="Heading1"/>
-        <w:spacing w:before="295" w:after="295"/>
+        <w:spacing w:before="297" w:after="294" w:line="241" w:lineRule="auto"/>
       </w:pPr>
       <w:r>
         <w:t xml:space="preserve">Meeting notes</w:t>
@@ -13,7 +13,7 @@
     </w:p>
     <w:p>
       <w:pPr>
-        <w:spacing w:before="220" w:after="220"/>
+        <w:spacing w:before="294" w:after="220" w:line="241" w:lineRule="auto"/>
       </w:pPr>
       <w:r>
         <w:t xml:space="preserve">Held on </w:t>
@@ -54,7 +54,7 @@
     <w:p>
       <w:pPr>
         <w:pStyle w:val="Heading2"/>
-        <w:spacing w:before="274" w:after="274"/>
+        <w:spacing w:before="274" w:after="274" w:line="241" w:lineRule="auto"/>
       </w:pPr>
       <w:r>
         <w:t xml:space="preserve">Decisions</w:t>
@@ -66,7 +66,7 @@
           <w:ilvl w:val="0"/>
           <w:numId w:val="1"/>
         </w:numPr>
-        <w:spacing w:before="220"/>
+        <w:spacing w:before="274" w:line="241" w:lineRule="auto"/>
         <w:ind w:left="600" w:hanging="360"/>
       </w:pPr>
       <w:r>
@@ -79,6 +79,7 @@
           <w:ilvl w:val="1"/>
           <w:numId w:val="2"/>
         </w:numPr>
+        <w:spacing w:before="0" w:line="241" w:lineRule="auto"/>
         <w:ind w:left="1200" w:hanging="360"/>
       </w:pPr>
       <w:r>
@@ -91,6 +92,7 @@
           <w:ilvl w:val="1"/>
           <w:numId w:val="2"/>
         </w:numPr>
+        <w:spacing w:before="0" w:line="241" w:lineRule="auto"/>
         <w:ind w:left="1200" w:hanging="360"/>
       </w:pPr>
       <w:r>
@@ -103,7 +105,7 @@
           <w:ilvl w:val="0"/>
           <w:numId w:val="1"/>
         </w:numPr>
-        <w:spacing w:after="220"/>
+        <w:spacing w:before="0" w:after="220" w:line="241" w:lineRule="auto"/>
         <w:ind w:left="600" w:hanging="360"/>
       </w:pPr>
       <w:r>
@@ -119,7 +121,7 @@
     <w:p>
       <w:pPr>
         <w:pStyle w:val="Heading2"/>
-        <w:spacing w:before="274" w:after="274"/>
+        <w:spacing w:before="274" w:after="273" w:line="241" w:lineRule="auto"/>
       </w:pPr>
       <w:r>
         <w:t xml:space="preserve">Budget</w:t>
@@ -152,13 +154,14 @@
             <w:tcMar>
               <w:top w:w="60" w:type="dxa"/>
               <w:left w:w="120" w:type="dxa"/>
-              <w:bottom w:w="60" w:type="dxa"/>
+              <w:bottom w:w="59" w:type="dxa"/>
               <w:right w:w="120" w:type="dxa"/>
             </w:tcMar>
             <w:vAlign w:val="center"/>
           </w:tcPr>
           <w:p>
             <w:pPr>
+              <w:spacing w:before="1" w:after="0" w:line="241" w:lineRule="auto"/>
               <w:jc w:val="center"/>
               <w:rPr>
                 <w:b/>
@@ -189,13 +192,14 @@
             <w:tcMar>
               <w:top w:w="60" w:type="dxa"/>
               <w:left w:w="120" w:type="dxa"/>
-              <w:bottom w:w="60" w:type="dxa"/>
+              <w:bottom w:w="59" w:type="dxa"/>
               <w:right w:w="120" w:type="dxa"/>
             </w:tcMar>
             <w:vAlign w:val="center"/>
           </w:tcPr>
           <w:p>
             <w:pPr>
+              <w:spacing w:before="1" w:after="0" w:line="241" w:lineRule="auto"/>
               <w:jc w:val="right"/>
               <w:rPr>
                 <w:b/>
@@ -227,13 +231,15 @@
             <w:tcMar>
               <w:top w:w="60" w:type="dxa"/>
               <w:left w:w="120" w:type="dxa"/>
-              <w:bottom w:w="60" w:type="dxa"/>
+              <w:bottom w:w="59" w:type="dxa"/>
               <w:right w:w="120" w:type="dxa"/>
             </w:tcMar>
             <w:vAlign w:val="center"/>
           </w:tcPr>
           <w:p>
-            <w:pPr/>
+            <w:pPr>
+              <w:spacing w:before="1" w:after="0" w:line="241" w:lineRule="auto"/>
+            </w:pPr>
             <w:r>
               <w:t xml:space="preserve">New store</w:t>
             </w:r>
@@ -251,13 +257,14 @@
             <w:tcMar>
               <w:top w:w="60" w:type="dxa"/>
               <w:left w:w="120" w:type="dxa"/>
-              <w:bottom w:w="60" w:type="dxa"/>
+              <w:bottom w:w="59" w:type="dxa"/>
               <w:right w:w="120" w:type="dxa"/>
             </w:tcMar>
             <w:vAlign w:val="center"/>
           </w:tcPr>
           <w:p>
             <w:pPr>
+              <w:spacing w:before="1" w:after="0" w:line="241" w:lineRule="auto"/>
               <w:jc w:val="right"/>
             </w:pPr>
             <w:r>
@@ -280,13 +287,15 @@
             <w:tcMar>
               <w:top w:w="60" w:type="dxa"/>
               <w:left w:w="120" w:type="dxa"/>
-              <w:bottom w:w="60" w:type="dxa"/>
+              <w:bottom w:w="59" w:type="dxa"/>
               <w:right w:w="120" w:type="dxa"/>
             </w:tcMar>
             <w:vAlign w:val="center"/>
           </w:tcPr>
           <w:p>
-            <w:pPr/>
+            <w:pPr>
+              <w:spacing w:before="1" w:after="0" w:line="241" w:lineRule="auto"/>
+            </w:pPr>
             <w:r>
               <w:t xml:space="preserve">Online platform</w:t>
             </w:r>
@@ -305,13 +314,14 @@
             <w:tcMar>
               <w:top w:w="60" w:type="dxa"/>
               <w:left w:w="120" w:type="dxa"/>
-              <w:bottom w:w="60" w:type="dxa"/>
+              <w:bottom w:w="59" w:type="dxa"/>
               <w:right w:w="120" w:type="dxa"/>
             </w:tcMar>
             <w:vAlign w:val="center"/>
           </w:tcPr>
           <w:p>
             <w:pPr>
+              <w:spacing w:before="1" w:after="0" w:line="241" w:lineRule="auto"/>
               <w:jc w:val="right"/>
             </w:pPr>
             <w:r>
@@ -366,7 +376,7 @@
     </w:p>
     <w:p>
       <w:pPr>
-        <w:spacing w:before="279" w:after="220"/>
+        <w:spacing w:before="280" w:after="220" w:line="241" w:lineRule="auto"/>
         <w:jc w:val="center"/>
       </w:pPr>
       <w:r>
@@ -379,7 +389,7 @@
     </w:p>
     <w:p>
       <w:pPr>
-        <w:spacing w:before="220" w:after="220"/>
+        <w:spacing w:before="220" w:after="220" w:line="241" w:lineRule="auto"/>
       </w:pPr>
       <w:r>
         <w:drawing>
@@ -432,7 +442,7 @@
     </w:p>
     <w:p>
       <w:pPr>
-        <w:spacing w:before="220" w:after="220"/>
+        <w:spacing w:before="220" w:after="220" w:line="241" w:lineRule="auto"/>
         <w:ind w:left="600" w:right="600"/>
       </w:pPr>
       <w:r>
@@ -441,7 +451,7 @@
     </w:p>
     <w:p>
       <w:pPr>
-        <w:spacing w:before="251" w:after="189" w:line="295" w:lineRule="auto"/>
+        <w:spacing w:before="250" w:after="189" w:line="295" w:lineRule="auto"/>
         <w:jc w:val="both"/>
       </w:pPr>
       <w:r>

</xml_diff>